<commit_message>
Fill cover (Aleppo Univ. / Mechatronics / Eng. Saad Almoustafa); add Grad-CAM + interactive figures
- Cover/affiliation filled across EN+AR report, slides, engineering chapter, and the
  dashboard sidebar: Aleppo University — Faculty of Electrical & Electronic
  Engineering, Department of Mechatronics Engineering; Supervisor Eng. Saad
  Almoustafa; Fourth Year. Students: Mulham Fetna, Mohammad Zein Qabbani.
- Dashboard: Grad-CAM panel in the Test Lab (overlays where the CNN looks on the
  scalogram; Keras-3-safe layer-walk implementation) + interactive Plotly figures
  (back-EMF, torque-speed, MCSA spectrum, detection-vs-severity) in the Motor &
  Control and Fault Detection sections.
- Rebuilt all EN+AR PDFs/PPTX/DOCX with the real cover.

Co-Authored-By: Claude Opus 4.8 (1M context) <noreply@anthropic.com>
</commit_message>
<xml_diff>
--- a/docs/build/engineering-background-ar.docx
+++ b/docs/build/engineering-background-ar.docx
@@ -46,7 +46,35 @@
           <w:i/>
           <w:iCs/>
         </w:rPr>
-        <w:t xml:space="preserve">مختبر الأجهزة الكهربائية الصناعية · هندسة الميكاترونيكس.</w:t>
+        <w:t xml:space="preserve">جامعة حلب — كلية الهندسة الكهربائية والإلكترونية، قسم هندسة الميكاترونيكس. مختبر</w:t>
+      </w:r>
+      <w:r>
+        <w:rPr>
+          <w:i/>
+          <w:iCs/>
+        </w:rPr>
+        <w:t xml:space="preserve"> </w:t>
+      </w:r>
+      <w:r>
+        <w:rPr>
+          <w:i/>
+          <w:iCs/>
+        </w:rPr>
+        <w:t xml:space="preserve">الأجهزة الكهربائية الصناعية. إعداد الطالبين: ملهم فتنة، محمد زين قباني. إشراف: م. سعد</w:t>
+      </w:r>
+      <w:r>
+        <w:rPr>
+          <w:i/>
+          <w:iCs/>
+        </w:rPr>
+        <w:t xml:space="preserve"> </w:t>
+      </w:r>
+      <w:r>
+        <w:rPr>
+          <w:i/>
+          <w:iCs/>
+        </w:rPr>
+        <w:t xml:space="preserve">المصطفى (السنة الرابعة).</w:t>
       </w:r>
       <w:r>
         <w:t xml:space="preserve"> </w:t>

</xml_diff>